<commit_message>
Deploying to gh-pages from @ Morrison-Lab/ids@d6ff3f8a21a299f326a12ceed4e360997f3a3e86 🚀
</commit_message>
<xml_diff>
--- a/entropy.docx
+++ b/entropy.docx
@@ -15,7 +15,7 @@
         <w:pStyle w:val="Date"/>
       </w:pPr>
       <w:r>
-        <w:t xml:space="preserve">Last modified: 2026-10-23 23:06:06 (PDT)</w:t>
+        <w:t xml:space="preserve">Last modified: 2026-10-24 19:16:36 (PDT)</w:t>
       </w:r>
     </w:p>
     <w:p>
@@ -56,7 +56,7 @@
         <w:t xml:space="preserve">.</w:t>
       </w:r>
     </w:p>
-    <w:bookmarkStart w:id="17" w:name="sec-surprisal"/>
+    <w:bookmarkStart w:id="22" w:name="sec-surprisal"/>
     <w:p>
       <w:pPr>
         <w:pStyle w:val="Heading2"/>
@@ -1346,8 +1346,232 @@
       </w:r>
     </w:p>
     <w:bookmarkEnd w:id="16"/>
-    <w:bookmarkEnd w:id="17"/>
-    <w:bookmarkStart w:id="22" w:name="sec-conditional-entropy"/>
+    <w:bookmarkStart w:id="21" w:name="rem-surprisal-fisher-information"/>
+    <w:p>
+      <w:pPr>
+        <w:pStyle w:val="BodyText"/>
+      </w:pPr>
+      <w:r>
+        <w:rPr>
+          <w:i/>
+          <w:iCs/>
+        </w:rPr>
+        <w:t xml:space="preserve">Remark 3</w:t>
+      </w:r>
+      <w:r>
+        <w:t xml:space="preserve"> (Surprisal and the Fisher information). </w:t>
+      </w:r>
+      <w:r>
+        <w:t xml:space="preserve">When the probabilities depend on a parameter</w:t>
+      </w:r>
+      <w:r>
+        <w:t xml:space="preserve"> </w:t>
+      </w:r>
+      <m:oMath>
+        <m:r>
+          <m:t>θ</m:t>
+        </m:r>
+      </m:oMath>
+      <w:r>
+        <w:t xml:space="preserve">,</w:t>
+      </w:r>
+      <w:r>
+        <w:t xml:space="preserve"> </w:t>
+      </w:r>
+      <w:r>
+        <w:t xml:space="preserve">the</w:t>
+      </w:r>
+      <w:r>
+        <w:t xml:space="preserve"> </w:t>
+      </w:r>
+      <w:hyperlink w:anchor="def-surprisal">
+        <w:r>
+          <w:rPr>
+            <w:rStyle w:val="Hyperlink"/>
+          </w:rPr>
+          <w:t xml:space="preserve">surprisal</w:t>
+        </w:r>
+      </w:hyperlink>
+      <w:r>
+        <w:t xml:space="preserve"> </w:t>
+      </w:r>
+      <w:r>
+        <w:t xml:space="preserve">of an outcome</w:t>
+      </w:r>
+      <w:r>
+        <w:t xml:space="preserve"> </w:t>
+      </w:r>
+      <m:oMath>
+        <m:r>
+          <m:t>x</m:t>
+        </m:r>
+      </m:oMath>
+      <w:r>
+        <w:t xml:space="preserve"> </w:t>
+      </w:r>
+      <w:r>
+        <w:t xml:space="preserve">is</w:t>
+      </w:r>
+      <w:r>
+        <w:t xml:space="preserve"> </w:t>
+      </w:r>
+      <m:oMath>
+        <m:r>
+          <m:rPr>
+            <m:sty m:val="p"/>
+          </m:rPr>
+          <m:t>−</m:t>
+        </m:r>
+        <m:r>
+          <m:rPr>
+            <m:sty m:val="p"/>
+          </m:rPr>
+          <m:t>log</m:t>
+        </m:r>
+        <m:r>
+          <m:rPr>
+            <m:sty m:val="p"/>
+          </m:rPr>
+          <m:t>p</m:t>
+        </m:r>
+        <m:r>
+          <m:rPr>
+            <m:sty m:val="p"/>
+          </m:rPr>
+          <m:t>(</m:t>
+        </m:r>
+        <m:r>
+          <m:t>x</m:t>
+        </m:r>
+        <m:r>
+          <m:rPr>
+            <m:sty m:val="p"/>
+          </m:rPr>
+          <m:t>∣</m:t>
+        </m:r>
+        <m:r>
+          <m:t>θ</m:t>
+        </m:r>
+        <m:r>
+          <m:rPr>
+            <m:sty m:val="p"/>
+          </m:rPr>
+          <m:t>)</m:t>
+        </m:r>
+      </m:oMath>
+      <w:r>
+        <w:t xml:space="preserve">,</w:t>
+      </w:r>
+      <w:r>
+        <w:t xml:space="preserve"> </w:t>
+      </w:r>
+      <w:r>
+        <w:t xml:space="preserve">which is minus the log-likelihood.</w:t>
+      </w:r>
+      <w:r>
+        <w:t xml:space="preserve"> </w:t>
+      </w:r>
+      <w:r>
+        <w:t xml:space="preserve">Its derivative with respect to</w:t>
+      </w:r>
+      <w:r>
+        <w:t xml:space="preserve"> </w:t>
+      </w:r>
+      <m:oMath>
+        <m:r>
+          <m:t>θ</m:t>
+        </m:r>
+      </m:oMath>
+      <w:r>
+        <w:t xml:space="preserve"> </w:t>
+      </w:r>
+      <w:r>
+        <w:t xml:space="preserve">is minus the</w:t>
+      </w:r>
+      <w:r>
+        <w:t xml:space="preserve"> </w:t>
+      </w:r>
+      <w:hyperlink r:id="rId17">
+        <w:r>
+          <w:rPr>
+            <w:rStyle w:val="Hyperlink"/>
+          </w:rPr>
+          <w:t xml:space="preserve">score</w:t>
+        </w:r>
+      </w:hyperlink>
+      <w:r>
+        <w:t xml:space="preserve">.</w:t>
+      </w:r>
+      <w:r>
+        <w:t xml:space="preserve"> </w:t>
+      </w:r>
+      <w:r>
+        <w:t xml:space="preserve">The expected squared score is the</w:t>
+      </w:r>
+      <w:r>
+        <w:t xml:space="preserve"> </w:t>
+      </w:r>
+      <w:hyperlink r:id="rId18">
+        <w:r>
+          <w:rPr>
+            <w:rStyle w:val="Hyperlink"/>
+          </w:rPr>
+          <w:t xml:space="preserve">expected (Fisher) information</w:t>
+        </w:r>
+      </w:hyperlink>
+      <w:r>
+        <w:t xml:space="preserve">,</w:t>
+      </w:r>
+      <w:r>
+        <w:t xml:space="preserve"> </w:t>
+      </w:r>
+      <w:r>
+        <w:t xml:space="preserve">which is also the second derivative, at the true parameter value,</w:t>
+      </w:r>
+      <w:r>
+        <w:t xml:space="preserve"> </w:t>
+      </w:r>
+      <w:r>
+        <w:t xml:space="preserve">of the</w:t>
+      </w:r>
+      <w:r>
+        <w:t xml:space="preserve"> </w:t>
+      </w:r>
+      <w:hyperlink r:id="rId19">
+        <w:r>
+          <w:rPr>
+            <w:rStyle w:val="Hyperlink"/>
+          </w:rPr>
+          <w:t xml:space="preserve">Kullback–Leibler divergence</w:t>
+        </w:r>
+      </w:hyperlink>
+      <w:r>
+        <w:t xml:space="preserve"> </w:t>
+      </w:r>
+      <w:r>
+        <w:t xml:space="preserve">between the model at that value and the model at the varying value</w:t>
+      </w:r>
+      <w:r>
+        <w:t xml:space="preserve"> </w:t>
+      </w:r>
+      <w:r>
+        <w:t xml:space="preserve">(</w:t>
+      </w:r>
+      <w:hyperlink r:id="rId20">
+        <w:r>
+          <w:rPr>
+            <w:rStyle w:val="Hyperlink"/>
+          </w:rPr>
+          <w:t xml:space="preserve">proved in the sds notes</w:t>
+        </w:r>
+      </w:hyperlink>
+      <w:r>
+        <w:t xml:space="preserve">).</w:t>
+      </w:r>
+    </w:p>
+    <w:bookmarkEnd w:id="21"/>
+    <w:bookmarkEnd w:id="22"/>
+    <w:bookmarkStart w:id="27" w:name="sec-conditional-entropy"/>
     <w:p>
       <w:pPr>
         <w:pStyle w:val="Heading2"/>
@@ -1356,7 +1580,7 @@
         <w:t xml:space="preserve">2 Joint and conditional entropy</w:t>
       </w:r>
     </w:p>
-    <w:bookmarkStart w:id="18" w:name="def-joint-entropy"/>
+    <w:bookmarkStart w:id="23" w:name="def-joint-entropy"/>
     <w:p>
       <w:pPr>
         <w:pStyle w:val="FirstParagraph"/>
@@ -1776,8 +2000,8 @@
         <w:t xml:space="preserve">.</w:t>
       </w:r>
     </w:p>
-    <w:bookmarkEnd w:id="18"/>
-    <w:bookmarkStart w:id="19" w:name="def-entropy-given-value"/>
+    <w:bookmarkEnd w:id="23"/>
+    <w:bookmarkStart w:id="24" w:name="def-entropy-given-value"/>
     <w:p>
       <w:pPr>
         <w:pStyle w:val="BodyText"/>
@@ -2298,8 +2522,8 @@
         <w:t xml:space="preserve">.</w:t>
       </w:r>
     </w:p>
-    <w:bookmarkEnd w:id="19"/>
-    <w:bookmarkStart w:id="20" w:name="def-conditional-entropy"/>
+    <w:bookmarkEnd w:id="24"/>
+    <w:bookmarkStart w:id="25" w:name="def-conditional-entropy"/>
     <w:p>
       <w:pPr>
         <w:pStyle w:val="BodyText"/>
@@ -2745,8 +2969,8 @@
         <w:t xml:space="preserve">.</w:t>
       </w:r>
     </w:p>
-    <w:bookmarkEnd w:id="20"/>
-    <w:bookmarkStart w:id="21" w:name="thm-entropy-chain-rule"/>
+    <w:bookmarkEnd w:id="25"/>
+    <w:bookmarkStart w:id="26" w:name="thm-entropy-chain-rule"/>
     <w:p>
       <w:pPr>
         <w:pStyle w:val="BodyText"/>
@@ -2892,7 +3116,7 @@
         </m:oMath>
       </m:oMathPara>
     </w:p>
-    <w:bookmarkEnd w:id="21"/>
+    <w:bookmarkEnd w:id="26"/>
     <w:p>
       <w:pPr>
         <w:pStyle w:val="FirstParagraph"/>
@@ -4277,8 +4501,8 @@
         <w:t xml:space="preserve">.</w:t>
       </w:r>
     </w:p>
-    <w:bookmarkEnd w:id="22"/>
-    <w:bookmarkStart w:id="31" w:name="sec-mutual-information"/>
+    <w:bookmarkEnd w:id="27"/>
+    <w:bookmarkStart w:id="35" w:name="sec-mutual-information"/>
     <w:p>
       <w:pPr>
         <w:pStyle w:val="Heading2"/>
@@ -4287,7 +4511,7 @@
         <w:t xml:space="preserve">3 Mutual information</w:t>
       </w:r>
     </w:p>
-    <w:bookmarkStart w:id="23" w:name="def-mutual-information"/>
+    <w:bookmarkStart w:id="28" w:name="def-mutual-information"/>
     <w:p>
       <w:pPr>
         <w:pStyle w:val="FirstParagraph"/>
@@ -4573,8 +4797,8 @@
         <w:t xml:space="preserve">.</w:t>
       </w:r>
     </w:p>
-    <w:bookmarkEnd w:id="23"/>
-    <w:bookmarkStart w:id="24" w:name="thm-mutual-information-symmetric"/>
+    <w:bookmarkEnd w:id="28"/>
+    <w:bookmarkStart w:id="29" w:name="thm-mutual-information-symmetric"/>
     <w:p>
       <w:pPr>
         <w:pStyle w:val="BodyText"/>
@@ -4756,7 +4980,7 @@
         </m:oMath>
       </m:oMathPara>
     </w:p>
-    <w:bookmarkEnd w:id="24"/>
+    <w:bookmarkEnd w:id="29"/>
     <w:p>
       <w:pPr>
         <w:pStyle w:val="FirstParagraph"/>
@@ -5298,7 +5522,7 @@
         <w:t xml:space="preserve">by the same definition.</w:t>
       </w:r>
     </w:p>
-    <w:bookmarkStart w:id="26" w:name="rem-mutual-information-kl"/>
+    <w:bookmarkStart w:id="30" w:name="rem-mutual-information-kl"/>
     <w:p>
       <w:pPr>
         <w:pStyle w:val="BodyText"/>
@@ -5308,7 +5532,7 @@
           <w:i/>
           <w:iCs/>
         </w:rPr>
-        <w:t xml:space="preserve">Remark 3</w:t>
+        <w:t xml:space="preserve">Remark 4</w:t>
       </w:r>
       <w:r>
         <w:t xml:space="preserve"> (Mutual information as a divergence). </w:t>
@@ -5331,7 +5555,7 @@
       <w:r>
         <w:t xml:space="preserve"> </w:t>
       </w:r>
-      <w:hyperlink r:id="rId25">
+      <w:hyperlink r:id="rId19">
         <w:r>
           <w:rPr>
             <w:rStyle w:val="Hyperlink"/>
@@ -5593,8 +5817,8 @@
         <w:t xml:space="preserve">on average.</w:t>
       </w:r>
     </w:p>
-    <w:bookmarkEnd w:id="26"/>
-    <w:bookmarkStart w:id="27" w:name="def-information-gain"/>
+    <w:bookmarkEnd w:id="30"/>
+    <w:bookmarkStart w:id="31" w:name="def-information-gain"/>
     <w:p>
       <w:pPr>
         <w:pStyle w:val="BodyText"/>
@@ -5662,8 +5886,8 @@
         <w:t xml:space="preserve">.</w:t>
       </w:r>
     </w:p>
-    <w:bookmarkEnd w:id="27"/>
-    <w:bookmarkStart w:id="28" w:name="rem-information-gain"/>
+    <w:bookmarkEnd w:id="31"/>
+    <w:bookmarkStart w:id="32" w:name="rem-information-gain"/>
     <w:p>
       <w:pPr>
         <w:pStyle w:val="BodyText"/>
@@ -5673,7 +5897,7 @@
           <w:i/>
           <w:iCs/>
         </w:rPr>
-        <w:t xml:space="preserve">Remark 4</w:t>
+        <w:t xml:space="preserve">Remark 5</w:t>
       </w:r>
       <w:r>
         <w:t xml:space="preserve"> (Information gain is mutual information). </w:t>
@@ -5855,8 +6079,8 @@
         <w:t xml:space="preserve">.</w:t>
       </w:r>
     </w:p>
-    <w:bookmarkEnd w:id="28"/>
-    <w:bookmarkStart w:id="29" w:name="exr-information-gain"/>
+    <w:bookmarkEnd w:id="32"/>
+    <w:bookmarkStart w:id="33" w:name="exr-information-gain"/>
     <w:p>
       <w:pPr>
         <w:pStyle w:val="BodyText"/>
@@ -6255,7 +6479,7 @@
           <w:rPr>
             <w:rStyle w:val="Hyperlink"/>
           </w:rPr>
-          <w:t xml:space="preserve">Remark 4</w:t>
+          <w:t xml:space="preserve">Remark 5</w:t>
         </w:r>
       </w:hyperlink>
       <w:r>
@@ -6511,8 +6735,8 @@
         <w:t xml:space="preserve">Which split has the larger gain?</w:t>
       </w:r>
     </w:p>
-    <w:bookmarkEnd w:id="29"/>
-    <w:bookmarkStart w:id="30" w:name="sol-information-gain"/>
+    <w:bookmarkEnd w:id="33"/>
+    <w:bookmarkStart w:id="34" w:name="sol-information-gain"/>
     <w:p>
       <w:pPr>
         <w:pStyle w:val="FirstParagraph"/>
@@ -7997,9 +8221,9 @@
         <w:t xml:space="preserve">so its entropy gets less weight.</w:t>
       </w:r>
     </w:p>
-    <w:bookmarkEnd w:id="30"/>
-    <w:bookmarkEnd w:id="31"/>
-    <w:bookmarkStart w:id="38" w:name="references"/>
+    <w:bookmarkEnd w:id="34"/>
+    <w:bookmarkEnd w:id="35"/>
+    <w:bookmarkStart w:id="42" w:name="references"/>
     <w:p>
       <w:pPr>
         <w:pStyle w:val="Heading2"/>
@@ -8008,8 +8232,8 @@
         <w:t xml:space="preserve">References</w:t>
       </w:r>
     </w:p>
-    <w:bookmarkStart w:id="37" w:name="refs"/>
-    <w:bookmarkStart w:id="33" w:name="ref-cover2006elements"/>
+    <w:bookmarkStart w:id="41" w:name="refs"/>
+    <w:bookmarkStart w:id="37" w:name="ref-cover2006elements"/>
     <w:p>
       <w:pPr>
         <w:pStyle w:val="Bibliography"/>
@@ -8033,7 +8257,7 @@
       <w:r>
         <w:t xml:space="preserve"> </w:t>
       </w:r>
-      <w:hyperlink r:id="rId32">
+      <w:hyperlink r:id="rId36">
         <w:r>
           <w:rPr>
             <w:rStyle w:val="Hyperlink"/>
@@ -8045,8 +8269,8 @@
         <w:t xml:space="preserve">.</w:t>
       </w:r>
     </w:p>
-    <w:bookmarkEnd w:id="33"/>
-    <w:bookmarkStart w:id="34" w:name="ref-mackay2003information"/>
+    <w:bookmarkEnd w:id="37"/>
+    <w:bookmarkStart w:id="38" w:name="ref-mackay2003information"/>
     <w:p>
       <w:pPr>
         <w:pStyle w:val="Bibliography"/>
@@ -8068,8 +8292,8 @@
         <w:t xml:space="preserve">. Cambridge University Press.</w:t>
       </w:r>
     </w:p>
-    <w:bookmarkEnd w:id="34"/>
-    <w:bookmarkStart w:id="36" w:name="ref-quinlan1986induction"/>
+    <w:bookmarkEnd w:id="38"/>
+    <w:bookmarkStart w:id="40" w:name="ref-quinlan1986induction"/>
     <w:p>
       <w:pPr>
         <w:pStyle w:val="Bibliography"/>
@@ -8102,7 +8326,7 @@
       <w:r>
         <w:t xml:space="preserve"> </w:t>
       </w:r>
-      <w:hyperlink r:id="rId35">
+      <w:hyperlink r:id="rId39">
         <w:r>
           <w:rPr>
             <w:rStyle w:val="Hyperlink"/>
@@ -8114,9 +8338,9 @@
         <w:t xml:space="preserve">.</w:t>
       </w:r>
     </w:p>
-    <w:bookmarkEnd w:id="36"/>
-    <w:bookmarkEnd w:id="37"/>
-    <w:bookmarkEnd w:id="38"/>
+    <w:bookmarkEnd w:id="40"/>
+    <w:bookmarkEnd w:id="41"/>
+    <w:bookmarkEnd w:id="42"/>
     <w:sectPr>
       <w:footnotePr>
         <w:numRestart w:val="eachSect"/>

</xml_diff>

<commit_message>
Deploying to gh-pages from @ Morrison-Lab/ids@cd6157db76f2bf90cef7edf525340ebde7e67a2c 🚀
</commit_message>
<xml_diff>
--- a/entropy.docx
+++ b/entropy.docx
@@ -15,7 +15,7 @@
         <w:pStyle w:val="Date"/>
       </w:pPr>
       <w:r>
-        <w:t xml:space="preserve">Last modified: 2026-10-29 18:15:56 (PDT)</w:t>
+        <w:t xml:space="preserve">Last modified: 2026-10-30 16:19:07 (PDT)</w:t>
       </w:r>
     </w:p>
     <w:p>
@@ -56,7 +56,7 @@
         <w:t xml:space="preserve">.</w:t>
       </w:r>
     </w:p>
-    <w:bookmarkStart w:id="26" w:name="sec-surprisal"/>
+    <w:bookmarkStart w:id="30" w:name="sec-surprisal"/>
     <w:p>
       <w:pPr>
         <w:pStyle w:val="Heading2"/>
@@ -2844,7 +2844,7 @@
       </w:r>
     </w:p>
     <w:bookmarkEnd w:id="20"/>
-    <w:bookmarkStart w:id="25" w:name="rem-surprisal-fisher-information"/>
+    <w:bookmarkStart w:id="24" w:name="rem-differential-entropy-vs-entropy"/>
     <w:p>
       <w:pPr>
         <w:pStyle w:val="BodyText"/>
@@ -2855,6 +2855,714 @@
           <w:iCs/>
         </w:rPr>
         <w:t xml:space="preserve">Remark 4</w:t>
+      </w:r>
+      <w:r>
+        <w:t xml:space="preserve"> (Differential entropy differs from entropy). </w:t>
+      </w:r>
+      <w:r>
+        <w:t xml:space="preserve">A</w:t>
+      </w:r>
+      <w:r>
+        <w:t xml:space="preserve"> </w:t>
+      </w:r>
+      <w:hyperlink r:id="rId21">
+        <w:r>
+          <w:rPr>
+            <w:rStyle w:val="Hyperlink"/>
+          </w:rPr>
+          <w:t xml:space="preserve">density</w:t>
+        </w:r>
+      </w:hyperlink>
+      <w:r>
+        <w:t xml:space="preserve"> </w:t>
+      </w:r>
+      <w:r>
+        <w:t xml:space="preserve">value is not a probability,</w:t>
+      </w:r>
+      <w:r>
+        <w:t xml:space="preserve"> </w:t>
+      </w:r>
+      <w:r>
+        <w:t xml:space="preserve">so the</w:t>
+      </w:r>
+      <w:r>
+        <w:t xml:space="preserve"> </w:t>
+      </w:r>
+      <w:hyperlink r:id="rId22">
+        <w:r>
+          <w:rPr>
+            <w:rStyle w:val="Hyperlink"/>
+          </w:rPr>
+          <w:t xml:space="preserve">surprisal</w:t>
+        </w:r>
+      </w:hyperlink>
+      <w:r>
+        <w:t xml:space="preserve"> </w:t>
+      </w:r>
+      <w:r>
+        <w:t xml:space="preserve">of a continuous value</w:t>
+      </w:r>
+      <w:r>
+        <w:t xml:space="preserve"> </w:t>
+      </w:r>
+      <w:r>
+        <w:t xml:space="preserve">and the</w:t>
+      </w:r>
+      <w:r>
+        <w:t xml:space="preserve"> </w:t>
+      </w:r>
+      <w:hyperlink r:id="rId17">
+        <w:r>
+          <w:rPr>
+            <w:rStyle w:val="Hyperlink"/>
+          </w:rPr>
+          <w:t xml:space="preserve">entropy</w:t>
+        </w:r>
+      </w:hyperlink>
+      <w:r>
+        <w:t xml:space="preserve"> </w:t>
+      </w:r>
+      <w:r>
+        <w:t xml:space="preserve">of a continuous random variable</w:t>
+      </w:r>
+      <w:r>
+        <w:t xml:space="preserve"> </w:t>
+      </w:r>
+      <w:r>
+        <w:t xml:space="preserve">(the differential entropy)</w:t>
+      </w:r>
+      <w:r>
+        <w:t xml:space="preserve"> </w:t>
+      </w:r>
+      <w:r>
+        <w:t xml:space="preserve">behave differently from their discrete counterparts:</w:t>
+      </w:r>
+    </w:p>
+    <w:p>
+      <w:pPr>
+        <w:pStyle w:val="Compact"/>
+        <w:numPr>
+          <w:ilvl w:val="0"/>
+          <w:numId w:val="1001"/>
+        </w:numPr>
+      </w:pPr>
+      <w:r>
+        <w:rPr>
+          <w:b/>
+          <w:bCs/>
+        </w:rPr>
+        <w:t xml:space="preserve">Sign.</w:t>
+      </w:r>
+      <w:r>
+        <w:t xml:space="preserve"> </w:t>
+      </w:r>
+      <w:r>
+        <w:t xml:space="preserve">A density can exceed</w:t>
+      </w:r>
+      <w:r>
+        <w:t xml:space="preserve"> </w:t>
+      </w:r>
+      <m:oMath>
+        <m:r>
+          <m:t>1</m:t>
+        </m:r>
+      </m:oMath>
+      <w:r>
+        <w:t xml:space="preserve">,</w:t>
+      </w:r>
+      <w:r>
+        <w:t xml:space="preserve"> </w:t>
+      </w:r>
+      <w:r>
+        <w:t xml:space="preserve">so the surprisal</w:t>
+      </w:r>
+      <w:r>
+        <w:t xml:space="preserve"> </w:t>
+      </w:r>
+      <m:oMath>
+        <m:r>
+          <m:t>s</m:t>
+        </m:r>
+        <m:r>
+          <m:t>​</m:t>
+        </m:r>
+        <m:d>
+          <m:dPr>
+            <m:begChr m:val="("/>
+            <m:sepChr m:val=""/>
+            <m:endChr m:val=")"/>
+            <m:grow/>
+          </m:dPr>
+          <m:e>
+            <m:r>
+              <m:t>x</m:t>
+            </m:r>
+          </m:e>
+        </m:d>
+        <m:r>
+          <m:t>​</m:t>
+        </m:r>
+      </m:oMath>
+      <w:r>
+        <w:t xml:space="preserve"> </w:t>
+      </w:r>
+      <w:r>
+        <w:t xml:space="preserve">and the differential entropy can be negative,</w:t>
+      </w:r>
+      <w:r>
+        <w:t xml:space="preserve"> </w:t>
+      </w:r>
+      <w:r>
+        <w:t xml:space="preserve">as in the</w:t>
+      </w:r>
+      <w:r>
+        <w:t xml:space="preserve"> </w:t>
+      </w:r>
+      <w:hyperlink r:id="rId23">
+        <w:r>
+          <w:rPr>
+            <w:rStyle w:val="Hyperlink"/>
+          </w:rPr>
+          <w:t xml:space="preserve">uniform example</w:t>
+        </w:r>
+      </w:hyperlink>
+      <w:r>
+        <w:t xml:space="preserve"> </w:t>
+      </w:r>
+      <w:r>
+        <w:t xml:space="preserve">(Cover and Thomas 2006, sec. 8.1)</w:t>
+      </w:r>
+      <w:r>
+        <w:t xml:space="preserve">.</w:t>
+      </w:r>
+      <w:r>
+        <w:t xml:space="preserve"> </w:t>
+      </w:r>
+      <w:r>
+        <w:t xml:space="preserve">The entropy of a discrete random variable is never negative.</w:t>
+      </w:r>
+    </w:p>
+    <w:p>
+      <w:pPr>
+        <w:pStyle w:val="Compact"/>
+        <w:numPr>
+          <w:ilvl w:val="0"/>
+          <w:numId w:val="1001"/>
+        </w:numPr>
+      </w:pPr>
+      <w:r>
+        <w:rPr>
+          <w:b/>
+          <w:bCs/>
+        </w:rPr>
+        <w:t xml:space="preserve">Units.</w:t>
+      </w:r>
+      <w:r>
+        <w:t xml:space="preserve"> </w:t>
+      </w:r>
+      <w:r>
+        <w:t xml:space="preserve">Rescaling changes the differential entropy:</w:t>
+      </w:r>
+      <w:r>
+        <w:t xml:space="preserve"> </w:t>
+      </w:r>
+      <m:oMath>
+        <m:r>
+          <m:t>H</m:t>
+        </m:r>
+        <m:r>
+          <m:t>​</m:t>
+        </m:r>
+        <m:d>
+          <m:dPr>
+            <m:begChr m:val="("/>
+            <m:sepChr m:val=""/>
+            <m:endChr m:val=")"/>
+            <m:grow/>
+          </m:dPr>
+          <m:e>
+            <m:r>
+              <m:t>a</m:t>
+            </m:r>
+            <m:r>
+              <m:t>X</m:t>
+            </m:r>
+          </m:e>
+        </m:d>
+        <m:r>
+          <m:t>​</m:t>
+        </m:r>
+        <m:r>
+          <m:rPr>
+            <m:sty m:val="p"/>
+          </m:rPr>
+          <m:t>=</m:t>
+        </m:r>
+        <m:r>
+          <m:t>H</m:t>
+        </m:r>
+        <m:r>
+          <m:t>​</m:t>
+        </m:r>
+        <m:d>
+          <m:dPr>
+            <m:begChr m:val="("/>
+            <m:sepChr m:val=""/>
+            <m:endChr m:val=")"/>
+            <m:grow/>
+          </m:dPr>
+          <m:e>
+            <m:r>
+              <m:t>X</m:t>
+            </m:r>
+          </m:e>
+        </m:d>
+        <m:r>
+          <m:t>​</m:t>
+        </m:r>
+        <m:r>
+          <m:rPr>
+            <m:sty m:val="p"/>
+          </m:rPr>
+          <m:t>+</m:t>
+        </m:r>
+        <m:r>
+          <m:rPr>
+            <m:sty m:val="p"/>
+          </m:rPr>
+          <m:t>log</m:t>
+        </m:r>
+        <m:r>
+          <m:rPr>
+            <m:sty m:val="p"/>
+          </m:rPr>
+          <m:t>|</m:t>
+        </m:r>
+        <m:r>
+          <m:t>a</m:t>
+        </m:r>
+        <m:r>
+          <m:rPr>
+            <m:sty m:val="p"/>
+          </m:rPr>
+          <m:t>|</m:t>
+        </m:r>
+      </m:oMath>
+      <w:r>
+        <w:t xml:space="preserve"> </w:t>
+      </w:r>
+      <w:r>
+        <w:t xml:space="preserve">for a constant</w:t>
+      </w:r>
+      <w:r>
+        <w:t xml:space="preserve"> </w:t>
+      </w:r>
+      <m:oMath>
+        <m:r>
+          <m:t>a</m:t>
+        </m:r>
+        <m:r>
+          <m:rPr>
+            <m:sty m:val="p"/>
+          </m:rPr>
+          <m:t>≠</m:t>
+        </m:r>
+        <m:r>
+          <m:t>0</m:t>
+        </m:r>
+      </m:oMath>
+      <w:r>
+        <w:t xml:space="preserve"> </w:t>
+      </w:r>
+      <w:r>
+        <w:t xml:space="preserve">(Cover and Thomas 2006, Theorem 8.6.4)</w:t>
+      </w:r>
+      <w:r>
+        <w:t xml:space="preserve">.</w:t>
+      </w:r>
+      <w:r>
+        <w:t xml:space="preserve"> </w:t>
+      </w:r>
+      <w:r>
+        <w:t xml:space="preserve">Measuring the same quantity in metres rather than centimetres therefore changes it.</w:t>
+      </w:r>
+      <w:r>
+        <w:t xml:space="preserve"> </w:t>
+      </w:r>
+      <w:r>
+        <w:t xml:space="preserve">Adding a constant does not:</w:t>
+      </w:r>
+      <w:r>
+        <w:t xml:space="preserve"> </w:t>
+      </w:r>
+      <m:oMath>
+        <m:r>
+          <m:t>H</m:t>
+        </m:r>
+        <m:r>
+          <m:t>​</m:t>
+        </m:r>
+        <m:d>
+          <m:dPr>
+            <m:begChr m:val="("/>
+            <m:sepChr m:val=""/>
+            <m:endChr m:val=")"/>
+            <m:grow/>
+          </m:dPr>
+          <m:e>
+            <m:r>
+              <m:t>X</m:t>
+            </m:r>
+            <m:r>
+              <m:rPr>
+                <m:sty m:val="p"/>
+              </m:rPr>
+              <m:t>+</m:t>
+            </m:r>
+            <m:r>
+              <m:t>c</m:t>
+            </m:r>
+          </m:e>
+        </m:d>
+        <m:r>
+          <m:t>​</m:t>
+        </m:r>
+        <m:r>
+          <m:rPr>
+            <m:sty m:val="p"/>
+          </m:rPr>
+          <m:t>=</m:t>
+        </m:r>
+        <m:r>
+          <m:t>H</m:t>
+        </m:r>
+        <m:r>
+          <m:t>​</m:t>
+        </m:r>
+        <m:d>
+          <m:dPr>
+            <m:begChr m:val="("/>
+            <m:sepChr m:val=""/>
+            <m:endChr m:val=")"/>
+            <m:grow/>
+          </m:dPr>
+          <m:e>
+            <m:r>
+              <m:t>X</m:t>
+            </m:r>
+          </m:e>
+        </m:d>
+        <m:r>
+          <m:t>​</m:t>
+        </m:r>
+      </m:oMath>
+      <w:r>
+        <w:t xml:space="preserve"> </w:t>
+      </w:r>
+      <w:r>
+        <w:t xml:space="preserve">(Cover and Thomas 2006, Theorem 8.6.3)</w:t>
+      </w:r>
+      <w:r>
+        <w:t xml:space="preserve">.</w:t>
+      </w:r>
+    </w:p>
+    <w:p>
+      <w:pPr>
+        <w:pStyle w:val="Compact"/>
+        <w:numPr>
+          <w:ilvl w:val="0"/>
+          <w:numId w:val="1001"/>
+        </w:numPr>
+      </w:pPr>
+      <w:r>
+        <w:rPr>
+          <w:b/>
+          <w:bCs/>
+        </w:rPr>
+        <w:t xml:space="preserve">Not a limit of entropy.</w:t>
+      </w:r>
+      <w:r>
+        <w:t xml:space="preserve"> </w:t>
+      </w:r>
+      <w:r>
+        <w:t xml:space="preserve">Round a continuous</w:t>
+      </w:r>
+      <w:r>
+        <w:t xml:space="preserve"> </w:t>
+      </w:r>
+      <m:oMath>
+        <m:r>
+          <m:t>X</m:t>
+        </m:r>
+      </m:oMath>
+      <w:r>
+        <w:t xml:space="preserve"> </w:t>
+      </w:r>
+      <w:r>
+        <w:t xml:space="preserve">to bins of width</w:t>
+      </w:r>
+      <w:r>
+        <w:t xml:space="preserve"> </w:t>
+      </w:r>
+      <m:oMath>
+        <m:r>
+          <m:rPr>
+            <m:sty m:val="p"/>
+          </m:rPr>
+          <m:t>Δ</m:t>
+        </m:r>
+      </m:oMath>
+      <w:r>
+        <w:t xml:space="preserve">,</w:t>
+      </w:r>
+      <w:r>
+        <w:t xml:space="preserve"> </w:t>
+      </w:r>
+      <w:r>
+        <w:t xml:space="preserve">which gives a discrete random variable</w:t>
+      </w:r>
+      <w:r>
+        <w:t xml:space="preserve"> </w:t>
+      </w:r>
+      <m:oMath>
+        <m:sSup>
+          <m:e>
+            <m:r>
+              <m:t>X</m:t>
+            </m:r>
+          </m:e>
+          <m:sup>
+            <m:r>
+              <m:rPr>
+                <m:sty m:val="p"/>
+              </m:rPr>
+              <m:t>Δ</m:t>
+            </m:r>
+          </m:sup>
+        </m:sSup>
+      </m:oMath>
+      <w:r>
+        <w:t xml:space="preserve">.</w:t>
+      </w:r>
+      <w:r>
+        <w:t xml:space="preserve"> </w:t>
+      </w:r>
+      <w:r>
+        <w:t xml:space="preserve">Then</w:t>
+      </w:r>
+      <w:r>
+        <w:t xml:space="preserve"> </w:t>
+      </w:r>
+      <m:oMath>
+        <m:r>
+          <m:t>H</m:t>
+        </m:r>
+        <m:r>
+          <m:t>​</m:t>
+        </m:r>
+        <m:d>
+          <m:dPr>
+            <m:begChr m:val="("/>
+            <m:sepChr m:val=""/>
+            <m:endChr m:val=")"/>
+            <m:grow/>
+          </m:dPr>
+          <m:e>
+            <m:sSup>
+              <m:e>
+                <m:r>
+                  <m:t>X</m:t>
+                </m:r>
+              </m:e>
+              <m:sup>
+                <m:r>
+                  <m:rPr>
+                    <m:sty m:val="p"/>
+                  </m:rPr>
+                  <m:t>Δ</m:t>
+                </m:r>
+              </m:sup>
+            </m:sSup>
+          </m:e>
+        </m:d>
+        <m:r>
+          <m:t>​</m:t>
+        </m:r>
+        <m:r>
+          <m:rPr>
+            <m:sty m:val="p"/>
+          </m:rPr>
+          <m:t>+</m:t>
+        </m:r>
+        <m:r>
+          <m:rPr>
+            <m:sty m:val="p"/>
+          </m:rPr>
+          <m:t>log</m:t>
+        </m:r>
+        <m:r>
+          <m:rPr>
+            <m:sty m:val="p"/>
+          </m:rPr>
+          <m:t>Δ</m:t>
+        </m:r>
+        <m:r>
+          <m:rPr>
+            <m:sty m:val="p"/>
+          </m:rPr>
+          <m:t>→</m:t>
+        </m:r>
+        <m:r>
+          <m:t>H</m:t>
+        </m:r>
+        <m:r>
+          <m:t>​</m:t>
+        </m:r>
+        <m:d>
+          <m:dPr>
+            <m:begChr m:val="("/>
+            <m:sepChr m:val=""/>
+            <m:endChr m:val=")"/>
+            <m:grow/>
+          </m:dPr>
+          <m:e>
+            <m:r>
+              <m:t>X</m:t>
+            </m:r>
+          </m:e>
+        </m:d>
+        <m:r>
+          <m:t>​</m:t>
+        </m:r>
+      </m:oMath>
+      <w:r>
+        <w:t xml:space="preserve"> </w:t>
+      </w:r>
+      <w:r>
+        <w:t xml:space="preserve">as</w:t>
+      </w:r>
+      <w:r>
+        <w:t xml:space="preserve"> </w:t>
+      </w:r>
+      <m:oMath>
+        <m:r>
+          <m:rPr>
+            <m:sty m:val="p"/>
+          </m:rPr>
+          <m:t>Δ</m:t>
+        </m:r>
+        <m:r>
+          <m:rPr>
+            <m:sty m:val="p"/>
+          </m:rPr>
+          <m:t>→</m:t>
+        </m:r>
+        <m:r>
+          <m:t>0</m:t>
+        </m:r>
+      </m:oMath>
+      <w:r>
+        <w:t xml:space="preserve"> </w:t>
+      </w:r>
+      <w:r>
+        <w:t xml:space="preserve">(Cover and Thomas 2006, Theorem 8.3.1)</w:t>
+      </w:r>
+      <w:r>
+        <w:t xml:space="preserve">.</w:t>
+      </w:r>
+      <w:r>
+        <w:t xml:space="preserve"> </w:t>
+      </w:r>
+      <w:r>
+        <w:t xml:space="preserve">The entropy</w:t>
+      </w:r>
+      <w:r>
+        <w:t xml:space="preserve"> </w:t>
+      </w:r>
+      <m:oMath>
+        <m:r>
+          <m:t>H</m:t>
+        </m:r>
+        <m:r>
+          <m:t>​</m:t>
+        </m:r>
+        <m:d>
+          <m:dPr>
+            <m:begChr m:val="("/>
+            <m:sepChr m:val=""/>
+            <m:endChr m:val=")"/>
+            <m:grow/>
+          </m:dPr>
+          <m:e>
+            <m:sSup>
+              <m:e>
+                <m:r>
+                  <m:t>X</m:t>
+                </m:r>
+              </m:e>
+              <m:sup>
+                <m:r>
+                  <m:rPr>
+                    <m:sty m:val="p"/>
+                  </m:rPr>
+                  <m:t>Δ</m:t>
+                </m:r>
+              </m:sup>
+            </m:sSup>
+          </m:e>
+        </m:d>
+        <m:r>
+          <m:t>​</m:t>
+        </m:r>
+      </m:oMath>
+      <w:r>
+        <w:t xml:space="preserve"> </w:t>
+      </w:r>
+      <w:r>
+        <w:t xml:space="preserve">itself grows without bound as</w:t>
+      </w:r>
+      <w:r>
+        <w:t xml:space="preserve"> </w:t>
+      </w:r>
+      <m:oMath>
+        <m:r>
+          <m:rPr>
+            <m:sty m:val="p"/>
+          </m:rPr>
+          <m:t>Δ</m:t>
+        </m:r>
+        <m:r>
+          <m:rPr>
+            <m:sty m:val="p"/>
+          </m:rPr>
+          <m:t>→</m:t>
+        </m:r>
+        <m:r>
+          <m:t>0</m:t>
+        </m:r>
+      </m:oMath>
+      <w:r>
+        <w:t xml:space="preserve">,</w:t>
+      </w:r>
+      <w:r>
+        <w:t xml:space="preserve"> </w:t>
+      </w:r>
+      <w:r>
+        <w:t xml:space="preserve">so the differential entropy is not its limit.</w:t>
+      </w:r>
+    </w:p>
+    <w:bookmarkEnd w:id="24"/>
+    <w:bookmarkStart w:id="29" w:name="rem-surprisal-fisher-information"/>
+    <w:p>
+      <w:pPr>
+        <w:pStyle w:val="FirstParagraph"/>
+      </w:pPr>
+      <w:r>
+        <w:rPr>
+          <w:i/>
+          <w:iCs/>
+        </w:rPr>
+        <w:t xml:space="preserve">Remark 5</w:t>
       </w:r>
       <w:r>
         <w:t xml:space="preserve"> (Surprisal and the Fisher information). </w:t>
@@ -2989,7 +3697,7 @@
       <w:r>
         <w:t xml:space="preserve"> </w:t>
       </w:r>
-      <w:hyperlink r:id="rId21">
+      <w:hyperlink r:id="rId25">
         <w:r>
           <w:rPr>
             <w:rStyle w:val="Hyperlink"/>
@@ -3009,7 +3717,7 @@
       <w:r>
         <w:t xml:space="preserve"> </w:t>
       </w:r>
-      <w:hyperlink r:id="rId22">
+      <w:hyperlink r:id="rId26">
         <w:r>
           <w:rPr>
             <w:rStyle w:val="Hyperlink"/>
@@ -3035,7 +3743,7 @@
       <w:r>
         <w:t xml:space="preserve"> </w:t>
       </w:r>
-      <w:hyperlink r:id="rId23">
+      <w:hyperlink r:id="rId27">
         <w:r>
           <w:rPr>
             <w:rStyle w:val="Hyperlink"/>
@@ -3055,7 +3763,7 @@
       <w:r>
         <w:t xml:space="preserve">(</w:t>
       </w:r>
-      <w:hyperlink r:id="rId24">
+      <w:hyperlink r:id="rId28">
         <w:r>
           <w:rPr>
             <w:rStyle w:val="Hyperlink"/>
@@ -3067,9 +3775,9 @@
         <w:t xml:space="preserve">).</w:t>
       </w:r>
     </w:p>
-    <w:bookmarkEnd w:id="25"/>
-    <w:bookmarkEnd w:id="26"/>
-    <w:bookmarkStart w:id="31" w:name="sec-conditional-entropy"/>
+    <w:bookmarkEnd w:id="29"/>
+    <w:bookmarkEnd w:id="30"/>
+    <w:bookmarkStart w:id="35" w:name="sec-conditional-entropy"/>
     <w:p>
       <w:pPr>
         <w:pStyle w:val="Heading2"/>
@@ -3078,7 +3786,7 @@
         <w:t xml:space="preserve">2 Joint and conditional entropy</w:t>
       </w:r>
     </w:p>
-    <w:bookmarkStart w:id="27" w:name="def-joint-entropy"/>
+    <w:bookmarkStart w:id="31" w:name="def-joint-entropy"/>
     <w:p>
       <w:pPr>
         <w:pStyle w:val="FirstParagraph"/>
@@ -3499,8 +4207,8 @@
         <w:t xml:space="preserve">.</w:t>
       </w:r>
     </w:p>
-    <w:bookmarkEnd w:id="27"/>
-    <w:bookmarkStart w:id="28" w:name="def-entropy-given-value"/>
+    <w:bookmarkEnd w:id="31"/>
+    <w:bookmarkStart w:id="32" w:name="def-entropy-given-value"/>
     <w:p>
       <w:pPr>
         <w:pStyle w:val="BodyText"/>
@@ -4023,8 +4731,8 @@
         <w:t xml:space="preserve">.</w:t>
       </w:r>
     </w:p>
-    <w:bookmarkEnd w:id="28"/>
-    <w:bookmarkStart w:id="29" w:name="def-conditional-entropy"/>
+    <w:bookmarkEnd w:id="32"/>
+    <w:bookmarkStart w:id="33" w:name="def-conditional-entropy"/>
     <w:p>
       <w:pPr>
         <w:pStyle w:val="BodyText"/>
@@ -4471,8 +5179,8 @@
         <w:t xml:space="preserve">.</w:t>
       </w:r>
     </w:p>
-    <w:bookmarkEnd w:id="29"/>
-    <w:bookmarkStart w:id="30" w:name="thm-entropy-chain-rule"/>
+    <w:bookmarkEnd w:id="33"/>
+    <w:bookmarkStart w:id="34" w:name="thm-entropy-chain-rule"/>
     <w:p>
       <w:pPr>
         <w:pStyle w:val="BodyText"/>
@@ -4618,7 +5326,7 @@
         </m:oMath>
       </m:oMathPara>
     </w:p>
-    <w:bookmarkEnd w:id="30"/>
+    <w:bookmarkEnd w:id="34"/>
     <w:p>
       <w:pPr>
         <w:pStyle w:val="FirstParagraph"/>
@@ -6003,8 +6711,8 @@
         <w:t xml:space="preserve">.</w:t>
       </w:r>
     </w:p>
-    <w:bookmarkEnd w:id="31"/>
-    <w:bookmarkStart w:id="39" w:name="sec-mutual-information"/>
+    <w:bookmarkEnd w:id="35"/>
+    <w:bookmarkStart w:id="43" w:name="sec-mutual-information"/>
     <w:p>
       <w:pPr>
         <w:pStyle w:val="Heading2"/>
@@ -6013,7 +6721,7 @@
         <w:t xml:space="preserve">3 Mutual information</w:t>
       </w:r>
     </w:p>
-    <w:bookmarkStart w:id="32" w:name="def-mutual-information"/>
+    <w:bookmarkStart w:id="36" w:name="def-mutual-information"/>
     <w:p>
       <w:pPr>
         <w:pStyle w:val="FirstParagraph"/>
@@ -6299,8 +7007,8 @@
         <w:t xml:space="preserve">.</w:t>
       </w:r>
     </w:p>
-    <w:bookmarkEnd w:id="32"/>
-    <w:bookmarkStart w:id="33" w:name="thm-mutual-information-symmetric"/>
+    <w:bookmarkEnd w:id="36"/>
+    <w:bookmarkStart w:id="37" w:name="thm-mutual-information-symmetric"/>
     <w:p>
       <w:pPr>
         <w:pStyle w:val="BodyText"/>
@@ -6482,7 +7190,7 @@
         </m:oMath>
       </m:oMathPara>
     </w:p>
-    <w:bookmarkEnd w:id="33"/>
+    <w:bookmarkEnd w:id="37"/>
     <w:p>
       <w:pPr>
         <w:pStyle w:val="FirstParagraph"/>
@@ -7024,7 +7732,7 @@
         <w:t xml:space="preserve">by the same definition.</w:t>
       </w:r>
     </w:p>
-    <w:bookmarkStart w:id="34" w:name="rem-mutual-information-kl"/>
+    <w:bookmarkStart w:id="38" w:name="rem-mutual-information-kl"/>
     <w:p>
       <w:pPr>
         <w:pStyle w:val="BodyText"/>
@@ -7034,7 +7742,7 @@
           <w:i/>
           <w:iCs/>
         </w:rPr>
-        <w:t xml:space="preserve">Remark 5</w:t>
+        <w:t xml:space="preserve">Remark 6</w:t>
       </w:r>
       <w:r>
         <w:t xml:space="preserve"> (Mutual information as a divergence). </w:t>
@@ -7057,7 +7765,7 @@
       <w:r>
         <w:t xml:space="preserve"> </w:t>
       </w:r>
-      <w:hyperlink r:id="rId23">
+      <w:hyperlink r:id="rId27">
         <w:r>
           <w:rPr>
             <w:rStyle w:val="Hyperlink"/>
@@ -7319,8 +8027,8 @@
         <w:t xml:space="preserve">on average.</w:t>
       </w:r>
     </w:p>
-    <w:bookmarkEnd w:id="34"/>
-    <w:bookmarkStart w:id="35" w:name="def-information-gain"/>
+    <w:bookmarkEnd w:id="38"/>
+    <w:bookmarkStart w:id="39" w:name="def-information-gain"/>
     <w:p>
       <w:pPr>
         <w:pStyle w:val="BodyText"/>
@@ -7388,8 +8096,8 @@
         <w:t xml:space="preserve">.</w:t>
       </w:r>
     </w:p>
-    <w:bookmarkEnd w:id="35"/>
-    <w:bookmarkStart w:id="36" w:name="rem-information-gain"/>
+    <w:bookmarkEnd w:id="39"/>
+    <w:bookmarkStart w:id="40" w:name="rem-information-gain"/>
     <w:p>
       <w:pPr>
         <w:pStyle w:val="BodyText"/>
@@ -7399,7 +8107,7 @@
           <w:i/>
           <w:iCs/>
         </w:rPr>
-        <w:t xml:space="preserve">Remark 6</w:t>
+        <w:t xml:space="preserve">Remark 7</w:t>
       </w:r>
       <w:r>
         <w:t xml:space="preserve"> (Information gain is mutual information). </w:t>
@@ -7581,8 +8289,8 @@
         <w:t xml:space="preserve">.</w:t>
       </w:r>
     </w:p>
-    <w:bookmarkEnd w:id="36"/>
-    <w:bookmarkStart w:id="37" w:name="exr-information-gain"/>
+    <w:bookmarkEnd w:id="40"/>
+    <w:bookmarkStart w:id="41" w:name="exr-information-gain"/>
     <w:p>
       <w:pPr>
         <w:pStyle w:val="BodyText"/>
@@ -7981,7 +8689,7 @@
           <w:rPr>
             <w:rStyle w:val="Hyperlink"/>
           </w:rPr>
-          <w:t xml:space="preserve">Remark 6</w:t>
+          <w:t xml:space="preserve">Remark 7</w:t>
         </w:r>
       </w:hyperlink>
       <w:r>
@@ -8050,7 +8758,7 @@
       <w:pPr>
         <w:numPr>
           <w:ilvl w:val="0"/>
-          <w:numId w:val="1001"/>
+          <w:numId w:val="1002"/>
         </w:numPr>
       </w:pPr>
       <w:r>
@@ -8081,177 +8789,6 @@
       </m:oMath>
       <w:r>
         <w:t xml:space="preserve">.</w:t>
-      </w:r>
-    </w:p>
-    <w:p>
-      <w:pPr>
-        <w:numPr>
-          <w:ilvl w:val="0"/>
-          <w:numId w:val="1001"/>
-        </w:numPr>
-      </w:pPr>
-      <w:r>
-        <w:t xml:space="preserve">For each split, compute</w:t>
-      </w:r>
-      <w:r>
-        <w:t xml:space="preserve"> </w:t>
-      </w:r>
-      <m:oMath>
-        <m:r>
-          <m:t>H</m:t>
-        </m:r>
-        <m:r>
-          <m:rPr>
-            <m:sty m:val="p"/>
-          </m:rPr>
-          <m:t>(</m:t>
-        </m:r>
-        <m:r>
-          <m:t>Y</m:t>
-        </m:r>
-        <m:r>
-          <m:rPr>
-            <m:sty m:val="p"/>
-          </m:rPr>
-          <m:t>∣</m:t>
-        </m:r>
-        <m:r>
-          <m:t>X</m:t>
-        </m:r>
-        <m:r>
-          <m:rPr>
-            <m:sty m:val="p"/>
-          </m:rPr>
-          <m:t>=</m:t>
-        </m:r>
-        <m:r>
-          <m:t>x</m:t>
-        </m:r>
-        <m:r>
-          <m:rPr>
-            <m:sty m:val="p"/>
-          </m:rPr>
-          <m:t>)</m:t>
-        </m:r>
-      </m:oMath>
-      <w:r>
-        <w:t xml:space="preserve"> </w:t>
-      </w:r>
-      <w:r>
-        <w:t xml:space="preserve">for both branches,</w:t>
-      </w:r>
-      <w:r>
-        <w:t xml:space="preserve"> </w:t>
-      </w:r>
-      <w:r>
-        <w:t xml:space="preserve">and then</w:t>
-      </w:r>
-      <w:r>
-        <w:t xml:space="preserve"> </w:t>
-      </w:r>
-      <m:oMath>
-        <m:r>
-          <m:t>H</m:t>
-        </m:r>
-        <m:r>
-          <m:rPr>
-            <m:sty m:val="p"/>
-          </m:rPr>
-          <m:t>(</m:t>
-        </m:r>
-        <m:r>
-          <m:t>Y</m:t>
-        </m:r>
-        <m:r>
-          <m:rPr>
-            <m:sty m:val="p"/>
-          </m:rPr>
-          <m:t>∣</m:t>
-        </m:r>
-        <m:r>
-          <m:t>X</m:t>
-        </m:r>
-        <m:r>
-          <m:rPr>
-            <m:sty m:val="p"/>
-          </m:rPr>
-          <m:t>)</m:t>
-        </m:r>
-      </m:oMath>
-      <w:r>
-        <w:t xml:space="preserve">.</w:t>
-      </w:r>
-    </w:p>
-    <w:p>
-      <w:pPr>
-        <w:numPr>
-          <w:ilvl w:val="0"/>
-          <w:numId w:val="1001"/>
-        </w:numPr>
-      </w:pPr>
-      <w:r>
-        <w:t xml:space="preserve">Compute the information gain</w:t>
-      </w:r>
-      <w:r>
-        <w:t xml:space="preserve"> </w:t>
-      </w:r>
-      <m:oMath>
-        <m:r>
-          <m:t>I</m:t>
-        </m:r>
-        <m:r>
-          <m:rPr>
-            <m:sty m:val="p"/>
-          </m:rPr>
-          <m:t>(</m:t>
-        </m:r>
-        <m:r>
-          <m:t>X</m:t>
-        </m:r>
-        <m:r>
-          <m:rPr>
-            <m:sty m:val="p"/>
-          </m:rPr>
-          <m:t>;</m:t>
-        </m:r>
-        <m:r>
-          <m:t>Y</m:t>
-        </m:r>
-        <m:r>
-          <m:rPr>
-            <m:sty m:val="p"/>
-          </m:rPr>
-          <m:t>)</m:t>
-        </m:r>
-      </m:oMath>
-      <w:r>
-        <w:t xml:space="preserve"> </w:t>
-      </w:r>
-      <w:r>
-        <w:t xml:space="preserve">for each split.</w:t>
-      </w:r>
-      <w:r>
-        <w:t xml:space="preserve"> </w:t>
-      </w:r>
-      <w:r>
-        <w:t xml:space="preserve">Which split has the larger gain?</w:t>
-      </w:r>
-    </w:p>
-    <w:bookmarkEnd w:id="37"/>
-    <w:bookmarkStart w:id="38" w:name="sol-information-gain"/>
-    <w:p>
-      <w:pPr>
-        <w:pStyle w:val="FirstParagraph"/>
-      </w:pPr>
-      <w:r>
-        <w:rPr>
-          <w:i/>
-          <w:iCs/>
-        </w:rPr>
-        <w:t xml:space="preserve">Solution 1</w:t>
-      </w:r>
-      <w:r>
-        <w:t xml:space="preserve">. </w:t>
       </w:r>
     </w:p>
     <w:p>
@@ -8259,6 +8796,177 @@
         <w:numPr>
           <w:ilvl w:val="0"/>
           <w:numId w:val="1002"/>
+        </w:numPr>
+      </w:pPr>
+      <w:r>
+        <w:t xml:space="preserve">For each split, compute</w:t>
+      </w:r>
+      <w:r>
+        <w:t xml:space="preserve"> </w:t>
+      </w:r>
+      <m:oMath>
+        <m:r>
+          <m:t>H</m:t>
+        </m:r>
+        <m:r>
+          <m:rPr>
+            <m:sty m:val="p"/>
+          </m:rPr>
+          <m:t>(</m:t>
+        </m:r>
+        <m:r>
+          <m:t>Y</m:t>
+        </m:r>
+        <m:r>
+          <m:rPr>
+            <m:sty m:val="p"/>
+          </m:rPr>
+          <m:t>∣</m:t>
+        </m:r>
+        <m:r>
+          <m:t>X</m:t>
+        </m:r>
+        <m:r>
+          <m:rPr>
+            <m:sty m:val="p"/>
+          </m:rPr>
+          <m:t>=</m:t>
+        </m:r>
+        <m:r>
+          <m:t>x</m:t>
+        </m:r>
+        <m:r>
+          <m:rPr>
+            <m:sty m:val="p"/>
+          </m:rPr>
+          <m:t>)</m:t>
+        </m:r>
+      </m:oMath>
+      <w:r>
+        <w:t xml:space="preserve"> </w:t>
+      </w:r>
+      <w:r>
+        <w:t xml:space="preserve">for both branches,</w:t>
+      </w:r>
+      <w:r>
+        <w:t xml:space="preserve"> </w:t>
+      </w:r>
+      <w:r>
+        <w:t xml:space="preserve">and then</w:t>
+      </w:r>
+      <w:r>
+        <w:t xml:space="preserve"> </w:t>
+      </w:r>
+      <m:oMath>
+        <m:r>
+          <m:t>H</m:t>
+        </m:r>
+        <m:r>
+          <m:rPr>
+            <m:sty m:val="p"/>
+          </m:rPr>
+          <m:t>(</m:t>
+        </m:r>
+        <m:r>
+          <m:t>Y</m:t>
+        </m:r>
+        <m:r>
+          <m:rPr>
+            <m:sty m:val="p"/>
+          </m:rPr>
+          <m:t>∣</m:t>
+        </m:r>
+        <m:r>
+          <m:t>X</m:t>
+        </m:r>
+        <m:r>
+          <m:rPr>
+            <m:sty m:val="p"/>
+          </m:rPr>
+          <m:t>)</m:t>
+        </m:r>
+      </m:oMath>
+      <w:r>
+        <w:t xml:space="preserve">.</w:t>
+      </w:r>
+    </w:p>
+    <w:p>
+      <w:pPr>
+        <w:numPr>
+          <w:ilvl w:val="0"/>
+          <w:numId w:val="1002"/>
+        </w:numPr>
+      </w:pPr>
+      <w:r>
+        <w:t xml:space="preserve">Compute the information gain</w:t>
+      </w:r>
+      <w:r>
+        <w:t xml:space="preserve"> </w:t>
+      </w:r>
+      <m:oMath>
+        <m:r>
+          <m:t>I</m:t>
+        </m:r>
+        <m:r>
+          <m:rPr>
+            <m:sty m:val="p"/>
+          </m:rPr>
+          <m:t>(</m:t>
+        </m:r>
+        <m:r>
+          <m:t>X</m:t>
+        </m:r>
+        <m:r>
+          <m:rPr>
+            <m:sty m:val="p"/>
+          </m:rPr>
+          <m:t>;</m:t>
+        </m:r>
+        <m:r>
+          <m:t>Y</m:t>
+        </m:r>
+        <m:r>
+          <m:rPr>
+            <m:sty m:val="p"/>
+          </m:rPr>
+          <m:t>)</m:t>
+        </m:r>
+      </m:oMath>
+      <w:r>
+        <w:t xml:space="preserve"> </w:t>
+      </w:r>
+      <w:r>
+        <w:t xml:space="preserve">for each split.</w:t>
+      </w:r>
+      <w:r>
+        <w:t xml:space="preserve"> </w:t>
+      </w:r>
+      <w:r>
+        <w:t xml:space="preserve">Which split has the larger gain?</w:t>
+      </w:r>
+    </w:p>
+    <w:bookmarkEnd w:id="41"/>
+    <w:bookmarkStart w:id="42" w:name="sol-information-gain"/>
+    <w:p>
+      <w:pPr>
+        <w:pStyle w:val="FirstParagraph"/>
+      </w:pPr>
+      <w:r>
+        <w:rPr>
+          <w:i/>
+          <w:iCs/>
+        </w:rPr>
+        <w:t xml:space="preserve">Solution 1</w:t>
+      </w:r>
+      <w:r>
+        <w:t xml:space="preserve">. </w:t>
+      </w:r>
+    </w:p>
+    <w:p>
+      <w:pPr>
+        <w:numPr>
+          <w:ilvl w:val="0"/>
+          <w:numId w:val="1003"/>
         </w:numPr>
       </w:pPr>
       <w:r>
@@ -8441,7 +9149,7 @@
       <w:pPr>
         <w:numPr>
           <w:ilvl w:val="0"/>
-          <w:numId w:val="1002"/>
+          <w:numId w:val="1003"/>
         </w:numPr>
       </w:pPr>
       <w:r>
@@ -9430,7 +10138,7 @@
       <w:pPr>
         <w:numPr>
           <w:ilvl w:val="0"/>
-          <w:numId w:val="1002"/>
+          <w:numId w:val="1003"/>
         </w:numPr>
       </w:pPr>
       <w:r>
@@ -9515,7 +10223,7 @@
         <w:pStyle w:val="Compact"/>
         <w:numPr>
           <w:ilvl w:val="1"/>
-          <w:numId w:val="1003"/>
+          <w:numId w:val="1004"/>
         </w:numPr>
       </w:pPr>
       <w:r>
@@ -9559,7 +10267,7 @@
         <w:pStyle w:val="Compact"/>
         <w:numPr>
           <w:ilvl w:val="1"/>
-          <w:numId w:val="1003"/>
+          <w:numId w:val="1004"/>
         </w:numPr>
       </w:pPr>
       <w:r>
@@ -9723,9 +10431,9 @@
         <w:t xml:space="preserve">so its entropy gets less weight.</w:t>
       </w:r>
     </w:p>
-    <w:bookmarkEnd w:id="38"/>
-    <w:bookmarkEnd w:id="39"/>
-    <w:bookmarkStart w:id="46" w:name="references"/>
+    <w:bookmarkEnd w:id="42"/>
+    <w:bookmarkEnd w:id="43"/>
+    <w:bookmarkStart w:id="50" w:name="references"/>
     <w:p>
       <w:pPr>
         <w:pStyle w:val="Heading2"/>
@@ -9734,8 +10442,8 @@
         <w:t xml:space="preserve">References</w:t>
       </w:r>
     </w:p>
-    <w:bookmarkStart w:id="45" w:name="refs"/>
-    <w:bookmarkStart w:id="41" w:name="ref-cover2006elements"/>
+    <w:bookmarkStart w:id="49" w:name="refs"/>
+    <w:bookmarkStart w:id="45" w:name="ref-cover2006elements"/>
     <w:p>
       <w:pPr>
         <w:pStyle w:val="Bibliography"/>
@@ -9759,7 +10467,7 @@
       <w:r>
         <w:t xml:space="preserve"> </w:t>
       </w:r>
-      <w:hyperlink r:id="rId40">
+      <w:hyperlink r:id="rId44">
         <w:r>
           <w:rPr>
             <w:rStyle w:val="Hyperlink"/>
@@ -9771,8 +10479,8 @@
         <w:t xml:space="preserve">.</w:t>
       </w:r>
     </w:p>
-    <w:bookmarkEnd w:id="41"/>
-    <w:bookmarkStart w:id="42" w:name="ref-mackay2003information"/>
+    <w:bookmarkEnd w:id="45"/>
+    <w:bookmarkStart w:id="46" w:name="ref-mackay2003information"/>
     <w:p>
       <w:pPr>
         <w:pStyle w:val="Bibliography"/>
@@ -9794,8 +10502,8 @@
         <w:t xml:space="preserve">. Cambridge University Press.</w:t>
       </w:r>
     </w:p>
-    <w:bookmarkEnd w:id="42"/>
-    <w:bookmarkStart w:id="44" w:name="ref-quinlan1986induction"/>
+    <w:bookmarkEnd w:id="46"/>
+    <w:bookmarkStart w:id="48" w:name="ref-quinlan1986induction"/>
     <w:p>
       <w:pPr>
         <w:pStyle w:val="Bibliography"/>
@@ -9828,7 +10536,7 @@
       <w:r>
         <w:t xml:space="preserve"> </w:t>
       </w:r>
-      <w:hyperlink r:id="rId43">
+      <w:hyperlink r:id="rId47">
         <w:r>
           <w:rPr>
             <w:rStyle w:val="Hyperlink"/>
@@ -9840,9 +10548,9 @@
         <w:t xml:space="preserve">.</w:t>
       </w:r>
     </w:p>
-    <w:bookmarkEnd w:id="44"/>
-    <w:bookmarkEnd w:id="45"/>
-    <w:bookmarkEnd w:id="46"/>
+    <w:bookmarkEnd w:id="48"/>
+    <w:bookmarkEnd w:id="49"/>
+    <w:bookmarkEnd w:id="50"/>
     <w:sectPr>
       <w:footnotePr>
         <w:numRestart w:val="eachSect"/>
@@ -9947,91 +10655,6 @@
     <w:lvl w:ilvl="8">
       <w:numFmt w:val="bullet"/>
       <w:lvlText w:val=" "/>
-      <w:lvlJc w:val="left"/>
-      <w:pPr>
-        <w:ind w:left="6480" w:hanging="360"/>
-      </w:pPr>
-    </w:lvl>
-  </w:abstractNum>
-  <w:abstractNum w:abstractNumId="99411">
-    <w:nsid w:val="00A99411"/>
-    <w:multiLevelType w:val="multilevel"/>
-    <w:lvl w:ilvl="0">
-      <w:start w:val="1"/>
-      <w:numFmt w:val="decimal"/>
-      <w:lvlText w:val="%1."/>
-      <w:lvlJc w:val="left"/>
-      <w:pPr>
-        <w:ind w:left="720" w:hanging="360"/>
-      </w:pPr>
-    </w:lvl>
-    <w:lvl w:ilvl="1">
-      <w:start w:val="1"/>
-      <w:numFmt w:val="decimal"/>
-      <w:lvlText w:val="%2."/>
-      <w:lvlJc w:val="left"/>
-      <w:pPr>
-        <w:ind w:left="1440" w:hanging="360"/>
-      </w:pPr>
-    </w:lvl>
-    <w:lvl w:ilvl="2">
-      <w:start w:val="1"/>
-      <w:numFmt w:val="decimal"/>
-      <w:lvlText w:val="%3."/>
-      <w:lvlJc w:val="left"/>
-      <w:pPr>
-        <w:ind w:left="2160" w:hanging="360"/>
-      </w:pPr>
-    </w:lvl>
-    <w:lvl w:ilvl="3">
-      <w:start w:val="1"/>
-      <w:numFmt w:val="decimal"/>
-      <w:lvlText w:val="%4."/>
-      <w:lvlJc w:val="left"/>
-      <w:pPr>
-        <w:ind w:left="2880" w:hanging="360"/>
-      </w:pPr>
-    </w:lvl>
-    <w:lvl w:ilvl="4">
-      <w:start w:val="1"/>
-      <w:numFmt w:val="decimal"/>
-      <w:lvlText w:val="%5."/>
-      <w:lvlJc w:val="left"/>
-      <w:pPr>
-        <w:ind w:left="3600" w:hanging="360"/>
-      </w:pPr>
-    </w:lvl>
-    <w:lvl w:ilvl="5">
-      <w:start w:val="1"/>
-      <w:numFmt w:val="decimal"/>
-      <w:lvlText w:val="%6."/>
-      <w:lvlJc w:val="left"/>
-      <w:pPr>
-        <w:ind w:left="4320" w:hanging="360"/>
-      </w:pPr>
-    </w:lvl>
-    <w:lvl w:ilvl="6">
-      <w:start w:val="1"/>
-      <w:numFmt w:val="decimal"/>
-      <w:lvlText w:val="%7."/>
-      <w:lvlJc w:val="left"/>
-      <w:pPr>
-        <w:ind w:left="5040" w:hanging="360"/>
-      </w:pPr>
-    </w:lvl>
-    <w:lvl w:ilvl="7">
-      <w:start w:val="1"/>
-      <w:numFmt w:val="decimal"/>
-      <w:lvlText w:val="%8."/>
-      <w:lvlJc w:val="left"/>
-      <w:pPr>
-        <w:ind w:left="5760" w:hanging="360"/>
-      </w:pPr>
-    </w:lvl>
-    <w:lvl w:ilvl="8">
-      <w:start w:val="1"/>
-      <w:numFmt w:val="decimal"/>
-      <w:lvlText w:val="%9."/>
       <w:lvlJc w:val="left"/>
       <w:pPr>
         <w:ind w:left="6480" w:hanging="360"/>
@@ -10141,38 +10764,96 @@
       </w:rPr>
     </w:lvl>
   </w:abstractNum>
+  <w:abstractNum w:abstractNumId="99411">
+    <w:nsid w:val="00A99411"/>
+    <w:multiLevelType w:val="multilevel"/>
+    <w:lvl w:ilvl="0">
+      <w:start w:val="1"/>
+      <w:numFmt w:val="decimal"/>
+      <w:lvlText w:val="%1."/>
+      <w:lvlJc w:val="left"/>
+      <w:pPr>
+        <w:ind w:left="720" w:hanging="360"/>
+      </w:pPr>
+    </w:lvl>
+    <w:lvl w:ilvl="1">
+      <w:start w:val="1"/>
+      <w:numFmt w:val="decimal"/>
+      <w:lvlText w:val="%2."/>
+      <w:lvlJc w:val="left"/>
+      <w:pPr>
+        <w:ind w:left="1440" w:hanging="360"/>
+      </w:pPr>
+    </w:lvl>
+    <w:lvl w:ilvl="2">
+      <w:start w:val="1"/>
+      <w:numFmt w:val="decimal"/>
+      <w:lvlText w:val="%3."/>
+      <w:lvlJc w:val="left"/>
+      <w:pPr>
+        <w:ind w:left="2160" w:hanging="360"/>
+      </w:pPr>
+    </w:lvl>
+    <w:lvl w:ilvl="3">
+      <w:start w:val="1"/>
+      <w:numFmt w:val="decimal"/>
+      <w:lvlText w:val="%4."/>
+      <w:lvlJc w:val="left"/>
+      <w:pPr>
+        <w:ind w:left="2880" w:hanging="360"/>
+      </w:pPr>
+    </w:lvl>
+    <w:lvl w:ilvl="4">
+      <w:start w:val="1"/>
+      <w:numFmt w:val="decimal"/>
+      <w:lvlText w:val="%5."/>
+      <w:lvlJc w:val="left"/>
+      <w:pPr>
+        <w:ind w:left="3600" w:hanging="360"/>
+      </w:pPr>
+    </w:lvl>
+    <w:lvl w:ilvl="5">
+      <w:start w:val="1"/>
+      <w:numFmt w:val="decimal"/>
+      <w:lvlText w:val="%6."/>
+      <w:lvlJc w:val="left"/>
+      <w:pPr>
+        <w:ind w:left="4320" w:hanging="360"/>
+      </w:pPr>
+    </w:lvl>
+    <w:lvl w:ilvl="6">
+      <w:start w:val="1"/>
+      <w:numFmt w:val="decimal"/>
+      <w:lvlText w:val="%7."/>
+      <w:lvlJc w:val="left"/>
+      <w:pPr>
+        <w:ind w:left="5040" w:hanging="360"/>
+      </w:pPr>
+    </w:lvl>
+    <w:lvl w:ilvl="7">
+      <w:start w:val="1"/>
+      <w:numFmt w:val="decimal"/>
+      <w:lvlText w:val="%8."/>
+      <w:lvlJc w:val="left"/>
+      <w:pPr>
+        <w:ind w:left="5760" w:hanging="360"/>
+      </w:pPr>
+    </w:lvl>
+    <w:lvl w:ilvl="8">
+      <w:start w:val="1"/>
+      <w:numFmt w:val="decimal"/>
+      <w:lvlText w:val="%9."/>
+      <w:lvlJc w:val="left"/>
+      <w:pPr>
+        <w:ind w:left="6480" w:hanging="360"/>
+      </w:pPr>
+    </w:lvl>
+  </w:abstractNum>
   <w:num w:numId="1000">
     <w:abstractNumId w:val="990"/>
   </w:num>
   <w:num w:numId="1001">
-    <w:abstractNumId w:val="99411"/>
-    <w:lvlOverride w:ilvl="0">
-      <w:startOverride w:val="1"/>
-    </w:lvlOverride>
-    <w:lvlOverride w:ilvl="1">
-      <w:startOverride w:val="1"/>
-    </w:lvlOverride>
-    <w:lvlOverride w:ilvl="2">
-      <w:startOverride w:val="1"/>
-    </w:lvlOverride>
-    <w:lvlOverride w:ilvl="3">
-      <w:startOverride w:val="1"/>
-    </w:lvlOverride>
-    <w:lvlOverride w:ilvl="4">
-      <w:startOverride w:val="1"/>
-    </w:lvlOverride>
-    <w:lvlOverride w:ilvl="5">
-      <w:startOverride w:val="1"/>
-    </w:lvlOverride>
-    <w:lvlOverride w:ilvl="6">
-      <w:startOverride w:val="1"/>
-    </w:lvlOverride>
-    <w:lvlOverride w:ilvl="7">
-      <w:startOverride w:val="1"/>
-    </w:lvlOverride>
-    <w:lvlOverride w:ilvl="8">
-      <w:startOverride w:val="1"/>
-    </w:lvlOverride>
+    <w:abstractNumId w:val="991"/>
   </w:num>
   <w:num w:numId="1002">
     <w:abstractNumId w:val="99411"/>
@@ -10205,6 +10886,36 @@
     </w:lvlOverride>
   </w:num>
   <w:num w:numId="1003">
+    <w:abstractNumId w:val="99411"/>
+    <w:lvlOverride w:ilvl="0">
+      <w:startOverride w:val="1"/>
+    </w:lvlOverride>
+    <w:lvlOverride w:ilvl="1">
+      <w:startOverride w:val="1"/>
+    </w:lvlOverride>
+    <w:lvlOverride w:ilvl="2">
+      <w:startOverride w:val="1"/>
+    </w:lvlOverride>
+    <w:lvlOverride w:ilvl="3">
+      <w:startOverride w:val="1"/>
+    </w:lvlOverride>
+    <w:lvlOverride w:ilvl="4">
+      <w:startOverride w:val="1"/>
+    </w:lvlOverride>
+    <w:lvlOverride w:ilvl="5">
+      <w:startOverride w:val="1"/>
+    </w:lvlOverride>
+    <w:lvlOverride w:ilvl="6">
+      <w:startOverride w:val="1"/>
+    </w:lvlOverride>
+    <w:lvlOverride w:ilvl="7">
+      <w:startOverride w:val="1"/>
+    </w:lvlOverride>
+    <w:lvlOverride w:ilvl="8">
+      <w:startOverride w:val="1"/>
+    </w:lvlOverride>
+  </w:num>
+  <w:num w:numId="1004">
     <w:abstractNumId w:val="991"/>
   </w:num>
 </w:numbering>

</xml_diff>